<commit_message>
docs(spec): v1.1 with per-screen Mobile/Desktop layouts
</commit_message>
<xml_diff>
--- a/ViewProof UI-UX Screen Specification.docx
+++ b/ViewProof UI-UX Screen Specification.docx
@@ -15,7 +15,7 @@
         <w:rPr>
           <w:i/>
         </w:rPr>
-        <w:t>Version 1.0 — Handoff for external redesign. Describes every screen, component, position, text, symbol, card, placeholder, and journey as built. A redesign must preserve: evidence-first honesty rules, 16px-min type, 48px-min targets, one primary action per screen, and no generic 'Verified' badges.</w:t>
+        <w:t>Version 1.1 — every screen specified twice: Mobile and Desktop. Handoff for external redesign. Must preserve: evidence-first honesty, 16px-min type, 48px-min targets, one primary action per screen, no generic 'Verified' badges.</w:t>
       </w:r>
     </w:p>
     <w:p>
@@ -23,7 +23,7 @@
         <w:pStyle w:val="Heading1"/>
       </w:pPr>
       <w:r>
-        <w:t>0. Global shell, tokens, and rules</w:t>
+        <w:t>0. Global shell, tokens, rules</w:t>
       </w:r>
     </w:p>
     <w:p>
@@ -31,7 +31,7 @@
         <w:pStyle w:val="Heading2"/>
       </w:pPr>
       <w:r>
-        <w:t>0.1 Shell (all screens)</w:t>
+        <w:t>0.1 Shell</w:t>
       </w:r>
     </w:p>
     <w:p>
@@ -39,7 +39,7 @@
         <w:pStyle w:val="ListBullet"/>
       </w:pPr>
       <w:r>
-        <w:t>Sticky floating glass-pill header, centered, max-w-6xl: [V logo tile 36px + 'ViewProof' 18px bold] left; desktop nav (Dashboard · Agent · Review · solid Sign in pill) right; phones show only solid Sign in pill.</w:t>
+        <w:t>Mobile: sticky floating glass pill (brand tile + name left, solid Sign-in pill right), content 16px padding, footer centered.</w:t>
       </w:r>
     </w:p>
     <w:p>
@@ -47,7 +47,7 @@
         <w:pStyle w:val="ListBullet"/>
       </w:pPr>
       <w:r>
-        <w:t>Footer (all screens, centered, 14px slate): 'ViewProof · honest viewings · we don't verify title or ownership'.</w:t>
+        <w:t>Desktop: same pill stretches to max-w-6xl with full nav (Dashboard · Agent · Review · Sign in); footer same, wider.</w:t>
       </w:r>
     </w:p>
     <w:p>
@@ -55,7 +55,7 @@
         <w:pStyle w:val="ListBullet"/>
       </w:pPr>
       <w:r>
-        <w:t>PWA install nudge (first eligible visit only, dismissable forever): glass card row — text 'Add ViewProof to your home screen? Your passes open even offline.' + solid [Install] + [×].</w:t>
+        <w:t>PWA install nudge (first eligible visit, dismissable): row card with text + solid Install + ×.</w:t>
       </w:r>
     </w:p>
     <w:p>
@@ -63,23 +63,15 @@
         <w:pStyle w:val="ListBullet"/>
       </w:pPr>
       <w:r>
-        <w:t>Background: sand canvas with faint fixed brand blobs (green/sun/sky ~20%); cards frosted white 78% (glass), controls frosted 55%, hairline borders, soft shadows.</w:t>
+        <w:t>Canvas: sand + faint fixed brand blobs; cards frosted white 78%, controls 55%, hairline borders, soft shadows; safe-area padding.</w:t>
       </w:r>
     </w:p>
     <w:p>
       <w:pPr>
-        <w:pStyle w:val="ListBullet"/>
+        <w:pStyle w:val="Heading2"/>
       </w:pPr>
       <w:r>
-        <w:t>Safe-area top/bottom padding; 16px horizontal padding mobile; content columns: task screens max-w-md→lg, content max-w-6xl, card max-w-5xl.</w:t>
-      </w:r>
-    </w:p>
-    <w:p>
-      <w:pPr>
-        <w:pStyle w:val="Heading2"/>
-      </w:pPr>
-      <w:r>
-        <w:t>0.2 Design tokens</w:t>
+        <w:t>0.2 Tokens</w:t>
       </w:r>
     </w:p>
     <w:tbl>
@@ -152,7 +144,7 @@
           </w:tcPr>
           <w:p>
             <w:r>
-              <w:t>Text, headings</w:t>
+              <w:t>Text/headings</w:t>
             </w:r>
           </w:p>
         </w:tc>
@@ -164,7 +156,7 @@
           </w:tcPr>
           <w:p>
             <w:r>
-              <w:t>proof-green-600</w:t>
+              <w:t>proof-green-600 / -100</w:t>
             </w:r>
           </w:p>
         </w:tc>
@@ -174,7 +166,7 @@
           </w:tcPr>
           <w:p>
             <w:r>
-              <w:t>#177E5C</w:t>
+              <w:t>#177E5C / #DCF5E8</w:t>
             </w:r>
           </w:p>
         </w:tc>
@@ -184,39 +176,7 @@
           </w:tcPr>
           <w:p>
             <w:r>
-              <w:t>Primary CTAs, confirmed</w:t>
-            </w:r>
-          </w:p>
-        </w:tc>
-      </w:tr>
-      <w:tr>
-        <w:tc>
-          <w:tcPr>
-            <w:tcW w:type="dxa" w:w="2880"/>
-          </w:tcPr>
-          <w:p>
-            <w:r>
-              <w:t>proof-green-100</w:t>
-            </w:r>
-          </w:p>
-        </w:tc>
-        <w:tc>
-          <w:tcPr>
-            <w:tcW w:type="dxa" w:w="2880"/>
-          </w:tcPr>
-          <w:p>
-            <w:r>
-              <w:t>#DCF5E8</w:t>
-            </w:r>
-          </w:p>
-        </w:tc>
-        <w:tc>
-          <w:tcPr>
-            <w:tcW w:type="dxa" w:w="2880"/>
-          </w:tcPr>
-          <w:p>
-            <w:r>
-              <w:t>Confirmed backgrounds</w:t>
+              <w:t>Primary CTAs / confirmed</w:t>
             </w:r>
           </w:p>
         </w:tc>
@@ -248,7 +208,7 @@
           </w:tcPr>
           <w:p>
             <w:r>
-              <w:t>Accents, offline/code panels</w:t>
+              <w:t>Accents, code/offline panels</w:t>
             </w:r>
           </w:p>
         </w:tc>
@@ -280,7 +240,7 @@
           </w:tcPr>
           <w:p>
             <w:r>
-              <w:t>Report/destructive, warnings</w:t>
+              <w:t>Report/destructive/warnings</w:t>
             </w:r>
           </w:p>
         </w:tc>
@@ -292,7 +252,7 @@
           </w:tcPr>
           <w:p>
             <w:r>
-              <w:t>sky-500 / sky-100</w:t>
+              <w:t>sky-500</w:t>
             </w:r>
           </w:p>
         </w:tc>
@@ -302,7 +262,7 @@
           </w:tcPr>
           <w:p>
             <w:r>
-              <w:t>#327CCB / #E1F0FF</w:t>
+              <w:t>#327CCB</w:t>
             </w:r>
           </w:p>
         </w:tc>
@@ -312,7 +272,7 @@
           </w:tcPr>
           <w:p>
             <w:r>
-              <w:t>Links, info</w:t>
+              <w:t>Links, back-links, info</w:t>
             </w:r>
           </w:p>
         </w:tc>
@@ -344,7 +304,7 @@
           </w:tcPr>
           <w:p>
             <w:r>
-              <w:t>Page canvas, inset panels</w:t>
+              <w:t>Canvas, inset panels</w:t>
             </w:r>
           </w:p>
         </w:tc>
@@ -366,7 +326,7 @@
           </w:tcPr>
           <w:p>
             <w:r>
-              <w:t>Display 32 / H1 26 / H2 18-20 / Body 16 / Small 14 / tabular numerals</w:t>
+              <w:t>Display 32 / H1 26 / H2 18 / Body 16 / Small 14 / tabular numerals</w:t>
             </w:r>
           </w:p>
         </w:tc>
@@ -376,7 +336,7 @@
           </w:tcPr>
           <w:p>
             <w:r>
-              <w:t>Never body below 14; inputs always 16 (blocks iOS zoom)</w:t>
+              <w:t>Inputs always 16 (no iOS zoom)</w:t>
             </w:r>
           </w:p>
         </w:tc>
@@ -398,7 +358,7 @@
           </w:tcPr>
           <w:p>
             <w:r>
-              <w:t>≥48px buttons/links, ≥44px min, 56–60px option rows</w:t>
+              <w:t>≥48px buttons/links; 56–60px option rows; 44px icon buttons</w:t>
             </w:r>
           </w:p>
         </w:tc>
@@ -407,9 +367,7 @@
             <w:tcW w:type="dxa" w:w="2880"/>
           </w:tcPr>
           <w:p>
-            <w:r>
-              <w:t>One-hand phone use</w:t>
-            </w:r>
+            <w:r/>
           </w:p>
         </w:tc>
       </w:tr>
@@ -430,7 +388,7 @@
           </w:tcPr>
           <w:p>
             <w:r>
-              <w:t>Cards 16 (rounded-2xl), controls 12, pills 999</w:t>
+              <w:t>Cards 16 / controls 12 / pills 999</w:t>
             </w:r>
           </w:p>
         </w:tc>
@@ -460,7 +418,7 @@
           </w:tcPr>
           <w:p>
             <w:r>
-              <w:t>220ms ease; hover lift desktop-only; reduced-motion + reduced-transparency fallbacks</w:t>
+              <w:t>220ms ease; hover-lift precise pointers only; reduced-motion + reduced-transparency fallbacks</w:t>
             </w:r>
           </w:p>
         </w:tc>
@@ -480,7 +438,7 @@
         <w:pStyle w:val="Heading2"/>
       </w:pPr>
       <w:r>
-        <w:t>0.3 Shared components (positions)</w:t>
+        <w:t>0.3 Shared components</w:t>
       </w:r>
     </w:p>
     <w:p>
@@ -488,7 +446,7 @@
         <w:pStyle w:val="ListBullet"/>
       </w:pPr>
       <w:r>
-        <w:t>HelpFooter — screen bottom, centered 16px slate: 'Need help? WhatsApp the agency — a person replies.' (+ contact number when known).</w:t>
+        <w:t>HelpFooter (bottom center, slate): 'Need help? WhatsApp the agency — a person replies.' + contact when known.</w:t>
       </w:r>
     </w:p>
     <w:p>
@@ -496,7 +454,7 @@
         <w:pStyle w:val="ListBullet"/>
       </w:pPr>
       <w:r>
-        <w:t>OfflineNote — centered sun panel: 'Offline? Saved passes still open.'</w:t>
+        <w:t>OfflineNote (sun, centered): 'Offline? Saved passes still open.'</w:t>
       </w:r>
     </w:p>
     <w:p>
@@ -504,7 +462,7 @@
         <w:pStyle w:val="ListBullet"/>
       </w:pPr>
       <w:r>
-        <w:t>EmptySlots — sand panel: bold 'No free slots right now' + 'New times appear when the agency reconfirms.' + [Notify me on WhatsApp] (wa.me deep link).</w:t>
+        <w:t>EmptySlots (sand, centered): bold title + one line + [Notify me on WhatsApp] wa.me link.</w:t>
       </w:r>
     </w:p>
     <w:p>
@@ -512,7 +470,7 @@
         <w:pStyle w:val="ListBullet"/>
       </w:pPr>
       <w:r>
-        <w:t>PausedNotice — slate panel: bold 'Paused for now' + 'Booking is closed until the agency reconfirms…' + [Notify me on WhatsApp].</w:t>
+        <w:t>PausedNotice (slate): bold 'Paused for now' + one line + [Notify me on WhatsApp].</w:t>
       </w:r>
     </w:p>
     <w:p>
@@ -520,7 +478,7 @@
         <w:pStyle w:val="ListBullet"/>
       </w:pPr>
       <w:r>
-        <w:t>Back link — staff subpages top-left: '← Dashboard', sky, 16px semibold, 44px.</w:t>
+        <w:t>Back link (staff subpages, top-left, sky semibold 44px): '← Dashboard'.</w:t>
       </w:r>
     </w:p>
     <w:p>
@@ -528,23 +486,23 @@
         <w:pStyle w:val="ListBullet"/>
       </w:pPr>
       <w:r>
-        <w:t>Status badges — pill, 14px bold: green (Active/Confirmed), sun (Requested), coral (StalePaused/NeedsReview), slate (rest).</w:t>
+        <w:t>Badges (pill 14px bold): green Active/Confirmed/paid · sun Requested/pending · coral Stale/Paused/NeedsReview · slate rest.</w:t>
       </w:r>
     </w:p>
     <w:p>
       <w:pPr>
-        <w:pStyle w:val="Heading2"/>
+        <w:pStyle w:val="ListBullet"/>
       </w:pPr>
       <w:r>
-        <w:t>0.4 Non-negotiable content rules</w:t>
+        <w:t>Symbols: ✓ confirmed · 🏅 score · 🌱 new · ⓘ info · ⚠ stale · 🔒 locked · 🎉 success · 🤝 reliability · ✍ terms · 📜 export · 🧭/🛠 states.</w:t>
       </w:r>
     </w:p>
     <w:p>
       <w:pPr>
-        <w:pStyle w:val="ListBullet"/>
+        <w:pStyle w:val="Heading2"/>
       </w:pPr>
       <w:r>
-        <w:t>No generic 'Verified' badge anywhere. Every status = icon + label + plain explanation.</w:t>
+        <w:t>0.4 Content laws</w:t>
       </w:r>
     </w:p>
     <w:p>
@@ -552,15 +510,7 @@
         <w:pStyle w:val="ListBullet"/>
       </w:pPr>
       <w:r>
-        <w:t>Exact dates only ('Sat 18 Oct'), never 'recently'. Title/ownership never claimed.</w:t>
-      </w:r>
-    </w:p>
-    <w:p>
-      <w:pPr>
-        <w:pStyle w:val="ListBullet"/>
-      </w:pPr>
-      <w:r>
-        <w:t>One obvious primary action per screen. Errors are human sentences with a next step, never codes.</w:t>
+        <w:t>No 'Verified' badges. Exact dates only. One primary action per screen. Errors are human sentences with a next step. Buyers never type IDs (links prefill).</w:t>
       </w:r>
     </w:p>
     <w:p>
@@ -573,10 +523,10 @@
     </w:p>
     <w:p>
       <w:pPr>
-        <w:pStyle w:val="ListBullet"/>
+        <w:pStyle w:val="Heading2"/>
       </w:pPr>
       <w:r>
-        <w:t>Hero (stacked mobile → 2-col desktop): eyebrow 'VIEWPROOF' green 14px bold; H1 34→48px 'See a place you trust, with someone you know'; sub 18px 'Fresh cards. Named hosts. Free WhatsApp booking.'; two 18px bold CTAs [I run an agency → /dashboard] solid green + [I'm hosting viewings → /agent] frosted.</w:t>
+        <w:t>Mobile (&lt;640px)</w:t>
       </w:r>
     </w:p>
     <w:p>
@@ -584,7 +534,7 @@
         <w:pStyle w:val="ListBullet"/>
       </w:pPr>
       <w:r>
-        <w:t>Example card panel (glass): 14px 'EXAMPLE CARD' label; 22px '3-bedroom · Gwarinpa, Abuja'; tabular 18px price; 3 evidence lines; solid demo CTA.</w:t>
+        <w:t>Stacked hero: eyebrow, H1 34px, 18px sub ('Fresh cards. Named hosts. Free WhatsApp booking.'), two full-width 18px CTAs (agency solid / hosting frosted).</w:t>
       </w:r>
     </w:p>
     <w:p>
@@ -592,15 +542,39 @@
         <w:pStyle w:val="ListBullet"/>
       </w:pPr>
       <w:r>
-        <w:t>How-it-works: 3 glass cards (1 col → 3 col): Share a card / Book free on WhatsApp / Meet + confirm with code — one line each.</w:t>
+        <w:t>Example card panel below; 3 how-it-works cards stacked; honesty footer line.</w:t>
       </w:r>
     </w:p>
     <w:p>
       <w:pPr>
+        <w:pStyle w:val="Heading2"/>
+      </w:pPr>
+      <w:r>
+        <w:t>Desktop (1024px+)</w:t>
+      </w:r>
+    </w:p>
+    <w:p>
+      <w:pPr>
         <w:pStyle w:val="ListBullet"/>
       </w:pPr>
       <w:r>
-        <w:t>Footer honesty line (centered slate): 'We don't verify title. We show what the agency confirmed — and who'll meet you.'</w:t>
+        <w:t>Two-column hero (pitch left, live example card right, H1 48px); CTAs side by side; how-it-works 3 columns; footer centered max-w-2xl.</w:t>
+      </w:r>
+    </w:p>
+    <w:p>
+      <w:pPr>
+        <w:pStyle w:val="Heading2"/>
+      </w:pPr>
+      <w:r>
+        <w:t>States &amp; notes</w:t>
+      </w:r>
+    </w:p>
+    <w:p>
+      <w:pPr>
+        <w:pStyle w:val="ListBullet"/>
+      </w:pPr>
+      <w:r>
+        <w:t>No states; purely presentational.</w:t>
       </w:r>
     </w:p>
     <w:p>
@@ -613,10 +587,10 @@
     </w:p>
     <w:p>
       <w:pPr>
-        <w:pStyle w:val="ListBullet"/>
+        <w:pStyle w:val="Heading2"/>
       </w:pPr>
       <w:r>
-        <w:t>Layout: single glass card (mobile stacked; desktop gallery 1.25fr left + booking panel right). Gallery 208px h (420px min desktop) or sand placeholder 'Photos coming — the agency hasn't added clear pictures yet.'</w:t>
+        <w:t>Mobile (&lt;640px)</w:t>
       </w:r>
     </w:p>
     <w:p>
@@ -624,7 +598,7 @@
         <w:pStyle w:val="ListBullet"/>
       </w:pPr>
       <w:r>
-        <w:t>Header block: H1 26px title; 16px area; 20px bold tabular price; evidence list 16px (2 lines: '✓ Fresh: [date] · meet [host]' + '🏅 [Fresh badge]' or '🌱 New agency — still earning its score.'); 'More about this card' expander (14px): photo date, title-not-checked, counted viewings.</w:t>
+        <w:t>Single glass card, gallery (208px) over details; title 26px, area, 20px price; 2-line evidence (fresh+host, score/new-agency); 'More about this card' expander (photo date, title-not-checked, viewing count); BookForm stacked (slot radios, name/phone, optional budget/move-date, consent checkbox, sticky bottom solid CTA).</w:t>
       </w:r>
     </w:p>
     <w:p>
@@ -632,15 +606,15 @@
         <w:pStyle w:val="ListBullet"/>
       </w:pPr>
       <w:r>
-        <w:t>Booking form (BookForm): H2 'Pick a time'; slot radio cards 56px (time bold + 'N places left · free' / 'Full', selected = green outline); H2 'Who's coming?'; labeled 16px inputs name / WhatsApp number (+14px privacy microcopy 'Code arrives here. Never shared.'); optional budget + move-date 2-col; consent checkbox 56px ('Yes — WhatsApp me… Free, no payment before we meet.'); sticky bottom solid CTA 'Book my free viewing' → pushes to /b/[id].</w:t>
+        <w:t>Paused → PausedNotice instead of form. Report link, AskBox chat, HelpFooter below.</w:t>
       </w:r>
     </w:p>
     <w:p>
       <w:pPr>
-        <w:pStyle w:val="ListBullet"/>
+        <w:pStyle w:val="Heading2"/>
       </w:pPr>
       <w:r>
-        <w:t>Paused variant: PausedNotice replaces the form. 'Something looks wrong? Tell us' link → /report?listing=[id]. AskBox chat (see §9) + HelpFooter close the card.</w:t>
+        <w:t>Desktop (1024px+)</w:t>
       </w:r>
     </w:p>
     <w:p>
@@ -648,15 +622,15 @@
         <w:pStyle w:val="ListBullet"/>
       </w:pPr>
       <w:r>
-        <w:t>States: missing slug → 'Hmm, this card is gone…' + [Back home]; no slots → EmptySlots.</w:t>
+        <w:t>Card splits gallery (420px min) left + booking panel right (max-w-5xl); slot radios 2-col; budget/move-date side by side; sticky CTA becomes static; chat and footer same order.</w:t>
       </w:r>
     </w:p>
     <w:p>
       <w:pPr>
-        <w:pStyle w:val="Heading1"/>
+        <w:pStyle w:val="Heading2"/>
       </w:pPr>
       <w:r>
-        <w:t>3. Viewing Pass — /b/[id] (public, holder link)</w:t>
+        <w:t>States &amp; notes</w:t>
       </w:r>
     </w:p>
     <w:p>
@@ -664,23 +638,23 @@
         <w:pStyle w:val="ListBullet"/>
       </w:pPr>
       <w:r>
-        <w:t>Centered glass card: 16px green '🎉 You're booked!' (or status); H1 22px listing; area; 18px tabular date; 'You'll meet [host] · [agency]'.</w:t>
+        <w:t>Bad slug → 'Hmm, this card is gone…' + Back home. No slots → EmptySlots. Paused → notify via wa.me.</w:t>
       </w:r>
     </w:p>
     <w:p>
       <w:pPr>
-        <w:pStyle w:val="ListBullet"/>
+        <w:pStyle w:val="Heading1"/>
       </w:pPr>
       <w:r>
-        <w:t>Sun panel: bold 'Code is on WhatsApp — show it at the venue.' + 'Expires ~[time] — come on time.' (Code itself NEVER rendered — WhatsApp only.)</w:t>
+        <w:t>3. Viewing Pass — /b/[id] (holder link)</w:t>
       </w:r>
     </w:p>
     <w:p>
       <w:pPr>
-        <w:pStyle w:val="ListBullet"/>
+        <w:pStyle w:val="Heading2"/>
       </w:pPr>
       <w:r>
-        <w:t>Actions: [Add to calendar] + CancelButton ('Can't make it? Cancel here' → PATCH cancel-buyer → 'Cancelled. Reply to the agency WhatsApp to rebook.'); 'Something was off? Report it' → /report?listing=&amp;booking=; OfflineNote; HelpFooter.</w:t>
+        <w:t>Mobile (&lt;640px)</w:t>
       </w:r>
     </w:p>
     <w:p>
@@ -688,7 +662,39 @@
         <w:pStyle w:val="ListBullet"/>
       </w:pPr>
       <w:r>
-        <w:t>Missing: 'Can't find this pass… newest WhatsApp link is the right one.'</w:t>
+        <w:t>Centered card: green status line, 22px listing, area, 18px date, host line; sun code panel ('Code is on WhatsApp — show it at the venue.' + expiry); stacked [Add to calendar] + CancelButton; report link; OfflineNote; HelpFooter. Code NEVER rendered.</w:t>
+      </w:r>
+    </w:p>
+    <w:p>
+      <w:pPr>
+        <w:pStyle w:val="Heading2"/>
+      </w:pPr>
+      <w:r>
+        <w:t>Desktop (1024px+)</w:t>
+      </w:r>
+    </w:p>
+    <w:p>
+      <w:pPr>
+        <w:pStyle w:val="ListBullet"/>
+      </w:pPr>
+      <w:r>
+        <w:t>Same card capped at lg centered; calendar + cancel side by side; rest identical.</w:t>
+      </w:r>
+    </w:p>
+    <w:p>
+      <w:pPr>
+        <w:pStyle w:val="Heading2"/>
+      </w:pPr>
+      <w:r>
+        <w:t>States &amp; notes</w:t>
+      </w:r>
+    </w:p>
+    <w:p>
+      <w:pPr>
+        <w:pStyle w:val="ListBullet"/>
+      </w:pPr>
+      <w:r>
+        <w:t>Bad id → 'Can't find this pass… newest WhatsApp link is right.' Cancel → status text, slot freed. Completed → status line + report link.</w:t>
       </w:r>
     </w:p>
     <w:p>
@@ -701,10 +707,10 @@
     </w:p>
     <w:p>
       <w:pPr>
-        <w:pStyle w:val="ListBullet"/>
+        <w:pStyle w:val="Heading2"/>
       </w:pPr>
       <w:r>
-        <w:t>Glass sheet: H1 24px 'What went wrong?' + 'Tap what happened — a real person reads it.'</w:t>
+        <w:t>Mobile (&lt;640px)</w:t>
       </w:r>
     </w:p>
     <w:p>
@@ -712,15 +718,15 @@
         <w:pStyle w:val="ListBullet"/>
       </w:pPr>
       <w:r>
-        <w:t>From card/pass links (?listing=&amp;booking=): IDs hidden, green confirm strip 'Linked to your viewing ✓'. Walk-ins see two 16px ID inputs instead.</w:t>
+        <w:t>Glass sheet: H1 24px + one-line sub; linked arrivals hide IDs behind green 'Linked to your viewing ✓' strip (walk-ins get two ID inputs); seven 60px radio rows (bold label + hint, selected green); optional free text; camera photo button + 'Photo added ✓'; sticky coral Send.</w:t>
       </w:r>
     </w:p>
     <w:p>
       <w:pPr>
-        <w:pStyle w:val="ListBullet"/>
+        <w:pStyle w:val="Heading2"/>
       </w:pPr>
       <w:r>
-        <w:t>7 radio rows 60px (bold label + hint): unavailable / price / location / agent-absent / differs / safety / other; selected = green fill + outline.</w:t>
+        <w:t>Desktop (1024px+)</w:t>
       </w:r>
     </w:p>
     <w:p>
@@ -728,15 +734,15 @@
         <w:pStyle w:val="ListBullet"/>
       </w:pPr>
       <w:r>
-        <w:t>Optional free text + camera photo button (capture=environment, client-compressed ≤800KB, GPS stripped, 'Photo added ✓'); sticky coral [Send report] → success message from server.</w:t>
+        <w:t>Same sheet capped at lg centered; radios stay single-column (thumb rhythm preserved on desktop).</w:t>
       </w:r>
     </w:p>
     <w:p>
       <w:pPr>
-        <w:pStyle w:val="Heading1"/>
+        <w:pStyle w:val="Heading2"/>
       </w:pPr>
       <w:r>
-        <w:t>5. AskBox chat (embedded in card)</w:t>
+        <w:t>States &amp; notes</w:t>
       </w:r>
     </w:p>
     <w:p>
@@ -744,15 +750,63 @@
         <w:pStyle w:val="ListBullet"/>
       </w:pPr>
       <w:r>
-        <w:t>Sand panel: bold 'Questions? Ask me 🙂' + 14px 'I answer from this card only — I never guess.'; 4 quick chips (44px pills): availability / host / booking / cancel.</w:t>
+        <w:t>Missing ID → inline prompt. Success → server message. Photo failure → 'send without it' fallback.</w:t>
       </w:r>
     </w:p>
     <w:p>
       <w:pPr>
+        <w:pStyle w:val="Heading1"/>
+      </w:pPr>
+      <w:r>
+        <w:t>5. AskBox chat (in card) — /c/[slug] §</w:t>
+      </w:r>
+    </w:p>
+    <w:p>
+      <w:pPr>
+        <w:pStyle w:val="Heading2"/>
+      </w:pPr>
+      <w:r>
+        <w:t>Mobile (&lt;640px)</w:t>
+      </w:r>
+    </w:p>
+    <w:p>
+      <w:pPr>
         <w:pStyle w:val="ListBullet"/>
       </w:pPr>
       <w:r>
-        <w:t>Thread: buyer bubbles green-right, answers white-left 16px; input 48px + solid [Ask]; Enter-to-send; per-question loading '…'.</w:t>
+        <w:t>Sand panel: bold title + 14px honesty line; 4 wrap chips (44px pills); thread (green-right buyer, white-left answers); 48px input + solid Ask; Enter-to-send.</w:t>
+      </w:r>
+    </w:p>
+    <w:p>
+      <w:pPr>
+        <w:pStyle w:val="Heading2"/>
+      </w:pPr>
+      <w:r>
+        <w:t>Desktop (1024px+)</w:t>
+      </w:r>
+    </w:p>
+    <w:p>
+      <w:pPr>
+        <w:pStyle w:val="ListBullet"/>
+      </w:pPr>
+      <w:r>
+        <w:t>Identical, full panel width; chips wrap in more columns.</w:t>
+      </w:r>
+    </w:p>
+    <w:p>
+      <w:pPr>
+        <w:pStyle w:val="Heading2"/>
+      </w:pPr>
+      <w:r>
+        <w:t>States &amp; notes</w:t>
+      </w:r>
+    </w:p>
+    <w:p>
+      <w:pPr>
+        <w:pStyle w:val="ListBullet"/>
+      </w:pPr>
+      <w:r>
+        <w:t>Network fail → '…check your network and try again.' in-thread.</w:t>
       </w:r>
     </w:p>
     <w:p>
@@ -765,10 +819,50 @@
     </w:p>
     <w:p>
       <w:pPr>
+        <w:pStyle w:val="Heading2"/>
+      </w:pPr>
+      <w:r>
+        <w:t>Mobile (&lt;640px)</w:t>
+      </w:r>
+    </w:p>
+    <w:p>
+      <w:pPr>
         <w:pStyle w:val="ListBullet"/>
       </w:pPr>
       <w:r>
-        <w:t>H1 'Hello 👋' + 'Type your WhatsApp number. We'll message you 6 numbers there.'; labeled tel input (+234 placeholder); solid [WhatsApp me the code]; code input (numeric, one-time-code autocomplete, 2xl tracking); [Verify — let me in]; status line; then [Link my agent spot →] (claims roster by phone, redirects /agent).</w:t>
+        <w:t>H1 'Hello 👋' + one-line how-to; labeled tel input (+234 placeholder); solid WhatsApp-code button; 6-box code input (2xl tracking, otp autocomplete); verify button; status line; then solid 'Link my agent spot →'.</w:t>
+      </w:r>
+    </w:p>
+    <w:p>
+      <w:pPr>
+        <w:pStyle w:val="Heading2"/>
+      </w:pPr>
+      <w:r>
+        <w:t>Desktop (1024px+)</w:t>
+      </w:r>
+    </w:p>
+    <w:p>
+      <w:pPr>
+        <w:pStyle w:val="ListBullet"/>
+      </w:pPr>
+      <w:r>
+        <w:t>Same column capped at lg centered.</w:t>
+      </w:r>
+    </w:p>
+    <w:p>
+      <w:pPr>
+        <w:pStyle w:val="Heading2"/>
+      </w:pPr>
+      <w:r>
+        <w:t>States &amp; notes</w:t>
+      </w:r>
+    </w:p>
+    <w:p>
+      <w:pPr>
+        <w:pStyle w:val="ListBullet"/>
+      </w:pPr>
+      <w:r>
+        <w:t>Wrong code → friendly retry text; unrostered number → claim explains owner must add it.</w:t>
       </w:r>
     </w:p>
     <w:p>
@@ -781,10 +875,10 @@
     </w:p>
     <w:p>
       <w:pPr>
-        <w:pStyle w:val="ListBullet"/>
+        <w:pStyle w:val="Heading2"/>
       </w:pPr>
       <w:r>
-        <w:t>H1 'You met? Confirm it ✅' + one-line how-to + loading/diary states ('Checking today's diary…' / sign-in hint).</w:t>
+        <w:t>Mobile (&lt;640px)</w:t>
       </w:r>
     </w:p>
     <w:p>
@@ -792,7 +886,7 @@
         <w:pStyle w:val="ListBullet"/>
       </w:pPr>
       <w:r>
-        <w:t>Today's viewings list: tappable booking buttons (time bold · title · buyer; 14px status + 🤝 reliability + ✍ 'Your cut: [terms]'); tap loads booking ID + focuses code; next booking preselected.</w:t>
+        <w:t>H1 + one line; loading/sign-in states; Today's viewings as tappable rows (bold time · title · buyer; 14px status + reliability + 'Your cut: terms'); tap loads ID + focuses code.</w:t>
       </w:r>
     </w:p>
     <w:p>
@@ -800,31 +894,31 @@
         <w:pStyle w:val="ListBullet"/>
       </w:pPr>
       <w:r>
-        <w:t>Labeled Booking ID input (from WhatsApp alert) + giant 3xl tracking code input; solid 20px [Confirm — we met ✅]; 'Didn't happen?' + 3 stacked outcome buttons (Buyer didn't come / I couldn't make it / Place unavailable).</w:t>
+        <w:t>Labeled Booking ID + giant 3xl code inputs; solid 20px Confirm; 'Didn't happen?' + 3 stacked outcome buttons; green receipt panel; Report; push-bell button + status; sun offline line.</w:t>
       </w:r>
     </w:p>
     <w:p>
       <w:pPr>
-        <w:pStyle w:val="ListBullet"/>
+        <w:pStyle w:val="Heading2"/>
       </w:pPr>
       <w:r>
-        <w:t>Receipt panel green on success ('Checked in [time]. Receipt sent on WhatsApp.'); warm error text; [Report it]; [Switch booking alerts on 🔔] (Web Push subscribe); sun offline note.</w:t>
+        <w:t>Desktop (1024px+)</w:t>
       </w:r>
     </w:p>
     <w:p>
       <w:pPr>
-        <w:pStyle w:val="Heading1"/>
+        <w:pStyle w:val="ListBullet"/>
       </w:pPr>
       <w:r>
-        <w:t>8. Owner login — /login; Onboard — /onboard</w:t>
+        <w:t>Same column capped at lg; outcomes go 3-across.</w:t>
       </w:r>
     </w:p>
     <w:p>
       <w:pPr>
-        <w:pStyle w:val="ListBullet"/>
+        <w:pStyle w:val="Heading2"/>
       </w:pPr>
       <w:r>
-        <w:t>Login: H1 'Welcome back 👋' + 'Type your work email. We'll send 6 numbers — no password needed.'; email input; solid [Send my code]; OTP input; [Verify — let me in] → /onboard. Statuses as sentences.</w:t>
+        <w:t>States &amp; notes</w:t>
       </w:r>
     </w:p>
     <w:p>
@@ -832,7 +926,71 @@
         <w:pStyle w:val="ListBullet"/>
       </w:pPr>
       <w:r>
-        <w:t>Onboard: H1 'Set up your agency 🏠' + 'Two minutes, then add places.'; states for checking/signed-out/has-agency; inputs agency name / public WhatsApp / comma areas; solid [Create my agency] → /dashboard/listings.</w:t>
+        <w:t>5 wrong codes → review flag. Offline → queued + reassurance.</w:t>
+      </w:r>
+    </w:p>
+    <w:p>
+      <w:pPr>
+        <w:pStyle w:val="Heading1"/>
+      </w:pPr>
+      <w:r>
+        <w:t>8. Owner login + Onboard — /login · /onboard</w:t>
+      </w:r>
+    </w:p>
+    <w:p>
+      <w:pPr>
+        <w:pStyle w:val="Heading2"/>
+      </w:pPr>
+      <w:r>
+        <w:t>Mobile (&lt;640px)</w:t>
+      </w:r>
+    </w:p>
+    <w:p>
+      <w:pPr>
+        <w:pStyle w:val="ListBullet"/>
+      </w:pPr>
+      <w:r>
+        <w:t>Login: 'Welcome back 👋' + email OTP, no passwords; labeled inputs; solid send/verify; → /onboard.</w:t>
+      </w:r>
+    </w:p>
+    <w:p>
+      <w:pPr>
+        <w:pStyle w:val="ListBullet"/>
+      </w:pPr>
+      <w:r>
+        <w:t>Onboard: 'Set up your agency 🏠' + agency name / WhatsApp / comma areas; solid Create → /dashboard/listings; signed-out + has-agency states with buttons.</w:t>
+      </w:r>
+    </w:p>
+    <w:p>
+      <w:pPr>
+        <w:pStyle w:val="Heading2"/>
+      </w:pPr>
+      <w:r>
+        <w:t>Desktop (1024px+)</w:t>
+      </w:r>
+    </w:p>
+    <w:p>
+      <w:pPr>
+        <w:pStyle w:val="ListBullet"/>
+      </w:pPr>
+      <w:r>
+        <w:t>Both capped columns centered; identical fields.</w:t>
+      </w:r>
+    </w:p>
+    <w:p>
+      <w:pPr>
+        <w:pStyle w:val="Heading2"/>
+      </w:pPr>
+      <w:r>
+        <w:t>States &amp; notes</w:t>
+      </w:r>
+    </w:p>
+    <w:p>
+      <w:pPr>
+        <w:pStyle w:val="ListBullet"/>
+      </w:pPr>
+      <w:r>
+        <w:t>Send/verify failures as sentences with retry.</w:t>
       </w:r>
     </w:p>
     <w:p>
@@ -845,10 +1003,10 @@
     </w:p>
     <w:p>
       <w:pPr>
-        <w:pStyle w:val="ListBullet"/>
+        <w:pStyle w:val="Heading2"/>
       </w:pPr>
       <w:r>
-        <w:t>Header row: H1 26→32px 'Owner dashboard' + frosted [Export CSV] (weekly CSV).</w:t>
+        <w:t>Mobile (&lt;640px)</w:t>
       </w:r>
     </w:p>
     <w:p>
@@ -856,15 +1014,39 @@
         <w:pStyle w:val="ListBullet"/>
       </w:pPr>
       <w:r>
-        <w:t>Conditional top banners (full width): coral lock banner if suspended; green 1-of-3 next-step banner (Step 1 Add place / Step 2 Publish / Step 3 Share card) until live.</w:t>
+        <w:t>Header row (H1 + frosted Export CSV); full-width conditional banners (coral lock; green 1-of-3 next-step with solid CTA); stacked glass sections: listings (counts + manage + stale alert), today (counts + open), scorecard rows + team link, issues + triage link.</w:t>
       </w:r>
     </w:p>
     <w:p>
       <w:pPr>
+        <w:pStyle w:val="Heading2"/>
+      </w:pPr>
+      <w:r>
+        <w:t>Desktop (1024px+)</w:t>
+      </w:r>
+    </w:p>
+    <w:p>
+      <w:pPr>
         <w:pStyle w:val="ListBullet"/>
       </w:pPr>
       <w:r>
-        <w:t>Grid 1→2→3 col glass sections: Listings (total, by-status line, [Manage listings →], coral stale alert); Today's viewings (by-status, [Open bookings →]); Scorecard rows (sand: name · attended/assigned (%) · no-shows · mismatches; [Manage team →]); Issues inbox (open count, [Open triage queue →]).</w:t>
+        <w:t>Sections in 2→3-col grid; banners span full width; checklist CTA inline.</w:t>
+      </w:r>
+    </w:p>
+    <w:p>
+      <w:pPr>
+        <w:pStyle w:val="Heading2"/>
+      </w:pPr>
+      <w:r>
+        <w:t>States &amp; notes</w:t>
+      </w:r>
+    </w:p>
+    <w:p>
+      <w:pPr>
+        <w:pStyle w:val="ListBullet"/>
+      </w:pPr>
+      <w:r>
+        <w:t>Loading text; suspended lock banner; empty scorecard/issues lines.</w:t>
       </w:r>
     </w:p>
     <w:p>
@@ -877,10 +1059,10 @@
     </w:p>
     <w:p>
       <w:pPr>
-        <w:pStyle w:val="ListBullet"/>
+        <w:pStyle w:val="Heading2"/>
       </w:pPr>
       <w:r>
-        <w:t>Header + [← Dashboard]; H1 'Your listings' + 'Fresh cards get bookings…'; [+ Add a place] solid + [Import CSV] frosted toggles.</w:t>
+        <w:t>Mobile (&lt;640px)</w:t>
       </w:r>
     </w:p>
     <w:p>
@@ -888,7 +1070,7 @@
         <w:pStyle w:val="ListBullet"/>
       </w:pPr>
       <w:r>
-        <w:t>Create form (glass): title / type select / area / numeric price / host select → [Save draft].</w:t>
+        <w:t>Header + back link; H1 + one-liner; [+ Add a place] + [Import CSV] toggle buttons.</w:t>
       </w:r>
     </w:p>
     <w:p>
@@ -896,7 +1078,7 @@
         <w:pStyle w:val="ListBullet"/>
       </w:pPr>
       <w:r>
-        <w:t>CSV import (glass): column guide text; mono textarea + file picker; [Import as drafts]; per-row result message.</w:t>
+        <w:t>Create glass form (stacked → 2-col desktop): title/type/area/price/host → Save draft.</w:t>
       </w:r>
     </w:p>
     <w:p>
@@ -904,7 +1086,7 @@
         <w:pStyle w:val="ListBullet"/>
       </w:pPr>
       <w:r>
-        <w:t>Listing cards (glass, 1→2→3 col): title 18px bold, area, tabular price, badge, 14px meta line (confirmed date · host · ✍ terms); [Edit details ▾] full-width.</w:t>
+        <w:t>CSV glass panel: column guide, mono textarea + file picker, Import as drafts, per-row results.</w:t>
       </w:r>
     </w:p>
     <w:p>
@@ -912,15 +1094,15 @@
         <w:pStyle w:val="ListBullet"/>
       </w:pPr>
       <w:r>
-        <w:t>Edit sheet (sand inset): photo grid (80px thumbs + × remove), dashed '+ Add photo (camera)' uploader, taken-on date (max today), price, host select, terms input ('Host's cut, agreed upfront…'), solid [Save details].</w:t>
+        <w:t>Listing cards: title/area/price/badge, 14px meta (date · host · ✍ terms), full-width Edit toggle; edit sheet (photo grid + camera, taken-on date cap today, price, host, terms input, Save); status buttons (Reconfirm/Publish with raw gate errors/View/Pause); slots expander (rows with taken counts + 44px ×, datetime + Add).</w:t>
       </w:r>
     </w:p>
     <w:p>
       <w:pPr>
-        <w:pStyle w:val="ListBullet"/>
+        <w:pStyle w:val="Heading2"/>
       </w:pPr>
       <w:r>
-        <w:t>Status row: [Reconfirm ✓] (stale/active/review), [Publish 🚀] (draft/review/unavailable — gate errors shown raw), Active adds [View card →] + [Pause].</w:t>
+        <w:t>Desktop (1024px+)</w:t>
       </w:r>
     </w:p>
     <w:p>
@@ -928,7 +1110,23 @@
         <w:pStyle w:val="ListBullet"/>
       </w:pPr>
       <w:r>
-        <w:t>Slots expander [Viewing times ▾]: rows (datetime · taken/capacity + 44px × delete, blocked with human error when held); datetime-local + [Add].</w:t>
+        <w:t>Cards 2→3-col; forms 2-col; edit sheet same fields; tables never used (cards persist).</w:t>
+      </w:r>
+    </w:p>
+    <w:p>
+      <w:pPr>
+        <w:pStyle w:val="Heading2"/>
+      </w:pPr>
+      <w:r>
+        <w:t>States &amp; notes</w:t>
+      </w:r>
+    </w:p>
+    <w:p>
+      <w:pPr>
+        <w:pStyle w:val="ListBullet"/>
+      </w:pPr>
+      <w:r>
+        <w:t>Empty → free-cards nudge. Publish gate errors shown verbatim. Slot delete blocked with human reason when held.</w:t>
       </w:r>
     </w:p>
     <w:p>
@@ -941,10 +1139,10 @@
     </w:p>
     <w:p>
       <w:pPr>
-        <w:pStyle w:val="ListBullet"/>
+        <w:pStyle w:val="Heading2"/>
       </w:pPr>
       <w:r>
-        <w:t>Header + [← Dashboard]; H1 'Upcoming viewings' + one-line sub; frosted [📜 Export commission evidence (CSV)] + 14px purpose line.</w:t>
+        <w:t>Mobile (&lt;640px)</w:t>
       </w:r>
     </w:p>
     <w:p>
@@ -952,7 +1150,7 @@
         <w:pStyle w:val="ListBullet"/>
       </w:pPr>
       <w:r>
-        <w:t>Upcoming cards: title 18px, status badge (green Requested? sun — Requested sun, Confirmed green), tabular time, buyer name + phone, 14px reliability ('🤝 4/4 attended 🌟') when known, area · host; actions [Message buyer (wa.me prefilled)] + [Confirm ✓] (Requested) + [Decline]/[Cancel viewing].</w:t>
+        <w:t>Header + back link; H1 + one-liner; frosted ledger-export button + purpose microcopy.</w:t>
       </w:r>
     </w:p>
     <w:p>
@@ -960,7 +1158,47 @@
         <w:pStyle w:val="ListBullet"/>
       </w:pPr>
       <w:r>
-        <w:t>'Recently done 🤝' section: completed cards with close box — price input + [Close deal 🤝] → closed state (price + payout Pending ⏳ + owner-only [Mark paid]) / 'paid ✓'.</w:t>
+        <w:t>Upcoming cards: title + badge, tabular time, buyer + phone, reliability line when known, area · host; Message buyer (wa.me prefilled) + Confirm/Decline/Cancel.</w:t>
+      </w:r>
+    </w:p>
+    <w:p>
+      <w:pPr>
+        <w:pStyle w:val="ListBullet"/>
+      </w:pPr>
+      <w:r>
+        <w:t>'Recently done' cards: title, buyer · host, time; close box (price input + Close deal) → closed state (price + payout Pending + owner Mark paid / paid ✓).</w:t>
+      </w:r>
+    </w:p>
+    <w:p>
+      <w:pPr>
+        <w:pStyle w:val="Heading2"/>
+      </w:pPr>
+      <w:r>
+        <w:t>Desktop (1024px+)</w:t>
+      </w:r>
+    </w:p>
+    <w:p>
+      <w:pPr>
+        <w:pStyle w:val="ListBullet"/>
+      </w:pPr>
+      <w:r>
+        <w:t>Cards 2→3-col; close box stays stacked inside cards.</w:t>
+      </w:r>
+    </w:p>
+    <w:p>
+      <w:pPr>
+        <w:pStyle w:val="Heading2"/>
+      </w:pPr>
+      <w:r>
+        <w:t>States &amp; notes</w:t>
+      </w:r>
+    </w:p>
+    <w:p>
+      <w:pPr>
+        <w:pStyle w:val="ListBullet"/>
+      </w:pPr>
+      <w:r>
+        <w:t>Empty upcoming/history lines; action errors as sentences; list refreshes after each action.</w:t>
       </w:r>
     </w:p>
     <w:p>
@@ -973,10 +1211,10 @@
     </w:p>
     <w:p>
       <w:pPr>
-        <w:pStyle w:val="ListBullet"/>
+        <w:pStyle w:val="Heading2"/>
       </w:pPr>
       <w:r>
-        <w:t>Header + [← Dashboard]; H1 + one-line rule ('Use the exact WhatsApp number they sign in with.'); statuses.</w:t>
+        <w:t>Mobile (&lt;640px)</w:t>
       </w:r>
     </w:p>
     <w:p>
@@ -984,7 +1222,7 @@
         <w:pStyle w:val="ListBullet"/>
       </w:pPr>
       <w:r>
-        <w:t>Add-host glass form (1→3 col): full name / public name (buyers see this) / WhatsApp number → solid [Add host]; success tells owner to have them sign in + link spot.</w:t>
+        <w:t>Header + back link; H1 + one-line number rule; statuses.</w:t>
       </w:r>
     </w:p>
     <w:p>
@@ -992,7 +1230,47 @@
         <w:pStyle w:val="ListBullet"/>
       </w:pPr>
       <w:r>
-        <w:t>Roster cards: public name bold (+ full), tabular phone, Active ✓/Inactive.</w:t>
+        <w:t>Add-host glass form (stacked → 3-col): full / public / WhatsApp number → solid Add; success tells owner the link-spot step.</w:t>
+      </w:r>
+    </w:p>
+    <w:p>
+      <w:pPr>
+        <w:pStyle w:val="ListBullet"/>
+      </w:pPr>
+      <w:r>
+        <w:t>Roster cards: public (full), tabular phone, Active ✓/Inactive.</w:t>
+      </w:r>
+    </w:p>
+    <w:p>
+      <w:pPr>
+        <w:pStyle w:val="Heading2"/>
+      </w:pPr>
+      <w:r>
+        <w:t>Desktop (1024px+)</w:t>
+      </w:r>
+    </w:p>
+    <w:p>
+      <w:pPr>
+        <w:pStyle w:val="ListBullet"/>
+      </w:pPr>
+      <w:r>
+        <w:t>Form 3-col; roster 2→3-col.</w:t>
+      </w:r>
+    </w:p>
+    <w:p>
+      <w:pPr>
+        <w:pStyle w:val="Heading2"/>
+      </w:pPr>
+      <w:r>
+        <w:t>States &amp; notes</w:t>
+      </w:r>
+    </w:p>
+    <w:p>
+      <w:pPr>
+        <w:pStyle w:val="ListBullet"/>
+      </w:pPr>
+      <w:r>
+        <w:t>Loading vs nobody states; validation per field.</w:t>
       </w:r>
     </w:p>
     <w:p>
@@ -1005,10 +1283,10 @@
     </w:p>
     <w:p>
       <w:pPr>
-        <w:pStyle w:val="ListBullet"/>
+        <w:pStyle w:val="Heading2"/>
       </w:pPr>
       <w:r>
-        <w:t>Header + [← Dashboard]; H1 + 'Conflicts and reports. Humans decide — nothing automatic.'; loading ('Fetching the queue…') vs calm empty state.</w:t>
+        <w:t>Mobile (&lt;640px)</w:t>
       </w:r>
     </w:p>
     <w:p>
@@ -1016,7 +1294,47 @@
         <w:pStyle w:val="ListBullet"/>
       </w:pPr>
       <w:r>
-        <w:t>Queue cards 1→2→3 col: 'category · status' bold, detail, timestamp; 1-col action stack [I'm looking into it] [Fixed ✓] [Dismiss] (52px).</w:t>
+        <w:t>Header + back link; H1 + 'Conflicts and reports. Humans decide — nothing automatic.'; loading vs calm-empty states.</w:t>
+      </w:r>
+    </w:p>
+    <w:p>
+      <w:pPr>
+        <w:pStyle w:val="ListBullet"/>
+      </w:pPr>
+      <w:r>
+        <w:t>Queue cards: 'category · status', detail, timestamp; 1-col 52px action stack (looking-into / Fixed ✓ / Dismiss).</w:t>
+      </w:r>
+    </w:p>
+    <w:p>
+      <w:pPr>
+        <w:pStyle w:val="Heading2"/>
+      </w:pPr>
+      <w:r>
+        <w:t>Desktop (1024px+)</w:t>
+      </w:r>
+    </w:p>
+    <w:p>
+      <w:pPr>
+        <w:pStyle w:val="ListBullet"/>
+      </w:pPr>
+      <w:r>
+        <w:t>Cards 2→3-col; actions stay stacked (deliberate, unhurried).</w:t>
+      </w:r>
+    </w:p>
+    <w:p>
+      <w:pPr>
+        <w:pStyle w:val="Heading2"/>
+      </w:pPr>
+      <w:r>
+        <w:t>States &amp; notes</w:t>
+      </w:r>
+    </w:p>
+    <w:p>
+      <w:pPr>
+        <w:pStyle w:val="ListBullet"/>
+      </w:pPr>
+      <w:r>
+        <w:t>Unauthed → sign-in prompt. Actions confirm via status text + reload.</w:t>
       </w:r>
     </w:p>
     <w:p>
@@ -1029,10 +1347,10 @@
     </w:p>
     <w:p>
       <w:pPr>
-        <w:pStyle w:val="ListBullet"/>
+        <w:pStyle w:val="Heading2"/>
       </w:pPr>
       <w:r>
-        <w:t>H1 'Landlord's office 🔑' + 'All shops, one screen. Lock doors, keep records.'</w:t>
+        <w:t>Mobile (&lt;640px)</w:t>
       </w:r>
     </w:p>
     <w:p>
@@ -1040,7 +1358,7 @@
         <w:pStyle w:val="ListBullet"/>
       </w:pPr>
       <w:r>
-        <w:t>Agency cards: name 18px + status badge; tabular contact; 14px meta (owner email · N listings · M hosts · since date); full-width red [Lock shop 🔒] (confirm dialog) / green [Reopen shop ✓].</w:t>
+        <w:t>H1 + 'All shops, one screen. Lock doors, keep records.'</w:t>
       </w:r>
     </w:p>
     <w:p>
@@ -1048,23 +1366,23 @@
         <w:pStyle w:val="ListBullet"/>
       </w:pPr>
       <w:r>
-        <w:t>Person-lock section: email + reason inputs, red [Lock] + [Unlock]; guidance prefers shop-lock; admin accounts unbannable here.</w:t>
+        <w:t>Agency cards: name + badge, tabular contact, 14px meta (owner · counts · since); full-width Lock (confirm dialog) / Reopen.</w:t>
       </w:r>
     </w:p>
     <w:p>
       <w:pPr>
-        <w:pStyle w:val="Heading1"/>
+        <w:pStyle w:val="ListBullet"/>
       </w:pPr>
       <w:r>
-        <w:t>15. Not-found + error</w:t>
+        <w:t>Person-lock panel: email + reason, red Lock + Unlock; guidance prefers shop-lock; admins unbannable.</w:t>
       </w:r>
     </w:p>
     <w:p>
       <w:pPr>
-        <w:pStyle w:val="ListBullet"/>
+        <w:pStyle w:val="Heading2"/>
       </w:pPr>
       <w:r>
-        <w:t>404: centered glass card, 🧭 48px, 'Lost your way?', '…Your bookings are safe — nothing was cancelled.', solid [Back home], HelpFooter.</w:t>
+        <w:t>Desktop (1024px+)</w:t>
       </w:r>
     </w:p>
     <w:p>
@@ -1072,15 +1390,95 @@
         <w:pStyle w:val="ListBullet"/>
       </w:pPr>
       <w:r>
-        <w:t>Error: 🛠, 'That hiccuped', '…nothing you did was lost…', solid [Try again] + frosted [Back home].</w:t>
+        <w:t>Cards 2→3-col; lock panel fields inline.</w:t>
       </w:r>
     </w:p>
     <w:p>
       <w:pPr>
+        <w:pStyle w:val="Heading2"/>
+      </w:pPr>
+      <w:r>
+        <w:t>States &amp; notes</w:t>
+      </w:r>
+    </w:p>
+    <w:p>
+      <w:pPr>
+        <w:pStyle w:val="ListBullet"/>
+      </w:pPr>
+      <w:r>
+        <w:t>Non-admin → 'Landlord only' message. Actions confirm + reload.</w:t>
+      </w:r>
+    </w:p>
+    <w:p>
+      <w:pPr>
         <w:pStyle w:val="Heading1"/>
       </w:pPr>
       <w:r>
-        <w:t>16. Placeholders, images, symbols inventory</w:t>
+        <w:t>15. Not-found + Error — 404 · error boundary</w:t>
+      </w:r>
+    </w:p>
+    <w:p>
+      <w:pPr>
+        <w:pStyle w:val="Heading2"/>
+      </w:pPr>
+      <w:r>
+        <w:t>Mobile (&lt;640px)</w:t>
+      </w:r>
+    </w:p>
+    <w:p>
+      <w:pPr>
+        <w:pStyle w:val="ListBullet"/>
+      </w:pPr>
+      <w:r>
+        <w:t>404: centered glass card, 🧭 48px, 'Lost your way?', bookings-safe line, solid Back home, HelpFooter.</w:t>
+      </w:r>
+    </w:p>
+    <w:p>
+      <w:pPr>
+        <w:pStyle w:val="ListBullet"/>
+      </w:pPr>
+      <w:r>
+        <w:t>Error: 🛠 'That hiccuped', nothing-lost line, solid Try again + frosted Back home.</w:t>
+      </w:r>
+    </w:p>
+    <w:p>
+      <w:pPr>
+        <w:pStyle w:val="Heading2"/>
+      </w:pPr>
+      <w:r>
+        <w:t>Desktop (1024px+)</w:t>
+      </w:r>
+    </w:p>
+    <w:p>
+      <w:pPr>
+        <w:pStyle w:val="ListBullet"/>
+      </w:pPr>
+      <w:r>
+        <w:t>Same cards centered; identical copy.</w:t>
+      </w:r>
+    </w:p>
+    <w:p>
+      <w:pPr>
+        <w:pStyle w:val="Heading2"/>
+      </w:pPr>
+      <w:r>
+        <w:t>States &amp; notes</w:t>
+      </w:r>
+    </w:p>
+    <w:p>
+      <w:pPr>
+        <w:pStyle w:val="ListBullet"/>
+      </w:pPr>
+      <w:r>
+        <w:t>No technical text ever (no codes, no stacks).</w:t>
+      </w:r>
+    </w:p>
+    <w:p>
+      <w:pPr>
+        <w:pStyle w:val="Heading1"/>
+      </w:pPr>
+      <w:r>
+        <w:t>16. Placeholders, images, icons</w:t>
       </w:r>
     </w:p>
     <w:tbl>
@@ -1111,7 +1509,7 @@
           </w:tcPr>
           <w:p>
             <w:r>
-              <w:t>Spec</w:t>
+              <w:t>Mobile</w:t>
             </w:r>
           </w:p>
         </w:tc>
@@ -1121,7 +1519,7 @@
           </w:tcPr>
           <w:p>
             <w:r>
-              <w:t>Where</w:t>
+              <w:t>Desktop</w:t>
             </w:r>
           </w:p>
         </w:tc>
@@ -1143,7 +1541,7 @@
           </w:tcPr>
           <w:p>
             <w:r>
-              <w:t>16:9 cover, 208px h mobile / 420px min desktop, eager; blur-up not required</w:t>
+              <w:t>16:9 cover, 208px h, eager</w:t>
             </w:r>
           </w:p>
         </w:tc>
@@ -1153,7 +1551,7 @@
           </w:tcPr>
           <w:p>
             <w:r>
-              <w:t>Card gallery</w:t>
+              <w:t>Same file, 420px min, left column fill</w:t>
             </w:r>
           </w:p>
         </w:tc>
@@ -1175,7 +1573,7 @@
           </w:tcPr>
           <w:p>
             <w:r>
-              <w:t>Sand panel, centered 16px: 'Photos coming — the agency hasn't added clear pictures yet.'</w:t>
+              <w:t>Sand panel 160px, centered line</w:t>
             </w:r>
           </w:p>
         </w:tc>
@@ -1185,7 +1583,7 @@
           </w:tcPr>
           <w:p>
             <w:r>
-              <w:t>Card gallery</w:t>
+              <w:t>Full-height panel, same line</w:t>
             </w:r>
           </w:p>
         </w:tc>
@@ -1207,7 +1605,7 @@
           </w:tcPr>
           <w:p>
             <w:r>
-              <w:t>80px rounded-lg cover + 36px × remove (white 90%)</w:t>
+              <w:t>80px grid + 36px ×</w:t>
             </w:r>
           </w:p>
         </w:tc>
@@ -1217,7 +1615,7 @@
           </w:tcPr>
           <w:p>
             <w:r>
-              <w:t>Edit sheet</w:t>
+              <w:t>Same (touch-first even on desktop)</w:t>
             </w:r>
           </w:p>
         </w:tc>
@@ -1239,7 +1637,7 @@
           </w:tcPr>
           <w:p>
             <w:r>
-              <w:t>36px rounded-xl solid green, white 18px 'V'</w:t>
+              <w:t>36px green rounded-xl, white V</w:t>
             </w:r>
           </w:p>
         </w:tc>
@@ -1249,7 +1647,7 @@
           </w:tcPr>
           <w:p>
             <w:r>
-              <w:t>Header</w:t>
+              <w:t>Identical</w:t>
             </w:r>
           </w:p>
         </w:tc>
@@ -1281,39 +1679,7 @@
           </w:tcPr>
           <w:p>
             <w:r>
-              <w:t>Manifest/layout</w:t>
-            </w:r>
-          </w:p>
-        </w:tc>
-      </w:tr>
-      <w:tr>
-        <w:tc>
-          <w:tcPr>
-            <w:tcW w:type="dxa" w:w="2880"/>
-          </w:tcPr>
-          <w:p>
-            <w:r>
-              <w:t>Status symbols</w:t>
-            </w:r>
-          </w:p>
-        </w:tc>
-        <w:tc>
-          <w:tcPr>
-            <w:tcW w:type="dxa" w:w="2880"/>
-          </w:tcPr>
-          <w:p>
-            <w:r>
-              <w:t>✓ confirmed · 🏅 score · 🌱 new · ⓘ info · ⚠ stale · 🔒 locked · 🎉 success · 🤝 reliability · ✍ terms · 📜 export</w:t>
-            </w:r>
-          </w:p>
-        </w:tc>
-        <w:tc>
-          <w:tcPr>
-            <w:tcW w:type="dxa" w:w="2880"/>
-          </w:tcPr>
-          <w:p>
-            <w:r>
-              <w:t>Across UI</w:t>
+              <w:t>Same assets</w:t>
             </w:r>
           </w:p>
         </w:tc>
@@ -1335,7 +1701,7 @@
           </w:tcPr>
           <w:p>
             <w:r>
-              <w:t>Emoji-led (🧭 🛠 🎉), no illustrations; calm panels, never red walls</w:t>
+              <w:t>Emoji-led, calm panels</w:t>
             </w:r>
           </w:p>
         </w:tc>
@@ -1345,7 +1711,7 @@
           </w:tcPr>
           <w:p>
             <w:r>
-              <w:t>States</w:t>
+              <w:t>Identical, centered</w:t>
             </w:r>
           </w:p>
         </w:tc>
@@ -1357,7 +1723,7 @@
         <w:pStyle w:val="Heading1"/>
       </w:pPr>
       <w:r>
-        <w:t>17. Responsive map</w:t>
+        <w:t>17. Breakpoint behavior map</w:t>
       </w:r>
     </w:p>
     <w:tbl>
@@ -1387,7 +1753,7 @@
           </w:tcPr>
           <w:p>
             <w:r>
-              <w:t>Behavior</w:t>
+              <w:t>Layout rules</w:t>
             </w:r>
           </w:p>
         </w:tc>
@@ -1399,7 +1765,7 @@
           </w:tcPr>
           <w:p>
             <w:r>
-              <w:t>&lt;640px phones</w:t>
+              <w:t>&lt;640</w:t>
             </w:r>
           </w:p>
         </w:tc>
@@ -1409,7 +1775,7 @@
           </w:tcPr>
           <w:p>
             <w:r>
-              <w:t>Single column; sticky bottom primary CTAs; 16px page padding; pill header collapses to brand + Sign in.</w:t>
+              <w:t>Single column; sticky bottom primary CTAs; 16px gutters; pill header = brand + Sign in; option rows full-width.</w:t>
             </w:r>
           </w:p>
         </w:tc>
@@ -1421,7 +1787,7 @@
           </w:tcPr>
           <w:p>
             <w:r>
-              <w:t>640–1024 tablets</w:t>
+              <w:t>640–1024</w:t>
             </w:r>
           </w:p>
         </w:tc>
@@ -1431,7 +1797,7 @@
           </w:tcPr>
           <w:p>
             <w:r>
-              <w:t>2-col option grids, dashboards, queues; pass actions 2-col.</w:t>
+              <w:t>2-col options, dashboards, queues; pass actions side by side; forms stay readable width.</w:t>
             </w:r>
           </w:p>
         </w:tc>
@@ -1443,7 +1809,7 @@
           </w:tcPr>
           <w:p>
             <w:r>
-              <w:t>1024+ desktop</w:t>
+              <w:t>1024+</w:t>
             </w:r>
           </w:p>
         </w:tc>
@@ -1453,7 +1819,7 @@
           </w:tcPr>
           <w:p>
             <w:r>
-              <w:t>Header full nav; hero 2-col; card gallery+panel; dashboards/queues 3-col; sticky CTAs become static; task forms cap at lg centered.</w:t>
+              <w:t>Full nav; hero 2-col; card gallery+panel; 3-col ops grids; sticky CTAs static; task forms capped lg centered; review actions stay 1-col by design.</w:t>
             </w:r>
           </w:p>
         </w:tc>
@@ -1465,7 +1831,7 @@
         <w:pStyle w:val="Heading1"/>
       </w:pPr>
       <w:r>
-        <w:t>18. User journeys (phase maps)</w:t>
+        <w:t>18. Journeys (all users, all phases)</w:t>
       </w:r>
     </w:p>
     <w:p>
@@ -1481,7 +1847,7 @@
         <w:pStyle w:val="ListNumber"/>
       </w:pPr>
       <w:r>
-        <w:t>Discovers card link → /c/[slug].</w:t>
+        <w:t>Discovers link → card (mobile-first entry).</w:t>
       </w:r>
     </w:p>
     <w:p>
@@ -1489,7 +1855,7 @@
         <w:pStyle w:val="ListNumber"/>
       </w:pPr>
       <w:r>
-        <w:t>Judges: price, refresh date, host, score, disclaimer.</w:t>
+        <w:t>Judges: price, exact date, host, score, disclaimer.</w:t>
       </w:r>
     </w:p>
     <w:p>
@@ -1497,7 +1863,7 @@
         <w:pStyle w:val="ListNumber"/>
       </w:pPr>
       <w:r>
-        <w:t>Books via BookForm → /b/[id] pass.</w:t>
+        <w:t>Books via form → pass (code on WhatsApp).</w:t>
       </w:r>
     </w:p>
     <w:p>
@@ -1505,7 +1871,7 @@
         <w:pStyle w:val="ListNumber"/>
       </w:pPr>
       <w:r>
-        <w:t>WhatsApp confirm + code; 24h/2h reminders.</w:t>
+        <w:t>Confirm + 24h/2h reminders.</w:t>
       </w:r>
     </w:p>
     <w:p>
@@ -1513,7 +1879,7 @@
         <w:pStyle w:val="ListNumber"/>
       </w:pPr>
       <w:r>
-        <w:t>Shows code at venue; receipt via WhatsApp.</w:t>
+        <w:t>Shows code; receipt via WhatsApp.</w:t>
       </w:r>
     </w:p>
     <w:p>
@@ -1521,7 +1887,7 @@
         <w:pStyle w:val="ListNumber"/>
       </w:pPr>
       <w:r>
-        <w:t>Reports via prefilled /report if mismatch.</w:t>
+        <w:t>Reports via prefilled link if mismatch.</w:t>
       </w:r>
     </w:p>
     <w:p>
@@ -1529,7 +1895,7 @@
         <w:pStyle w:val="ListNumber"/>
       </w:pPr>
       <w:r>
-        <w:t>Cancels via pass or CANCEL reply; slot freed. Branches: stale→PausedNotice+wa.me; no slots→EmptySlots+wa.me; bad link→not-found.</w:t>
+        <w:t>Cancels via pass or CANCEL; slot freed. Branches: stale→notify; no slots→notify; bad link→404.</w:t>
       </w:r>
     </w:p>
     <w:p>
@@ -1545,7 +1911,7 @@
         <w:pStyle w:val="ListNumber"/>
       </w:pPr>
       <w:r>
-        <w:t>Owner rosters number → /agent/login OTP → Link spot (claim).</w:t>
+        <w:t>Rostered → OTP login → Link spot.</w:t>
       </w:r>
     </w:p>
     <w:p>
@@ -1553,7 +1919,7 @@
         <w:pStyle w:val="ListNumber"/>
       </w:pPr>
       <w:r>
-        <w:t>WhatsApp agent_alert + push on booking.</w:t>
+        <w:t>WhatsApp alert + push per booking.</w:t>
       </w:r>
     </w:p>
     <w:p>
@@ -1561,7 +1927,7 @@
         <w:pStyle w:val="ListNumber"/>
       </w:pPr>
       <w:r>
-        <w:t>Day list on /agent; tap loads check-in.</w:t>
+        <w:t>Day list → tap → code → Confirm (or honest outcome).</w:t>
       </w:r>
     </w:p>
     <w:p>
@@ -1569,7 +1935,7 @@
         <w:pStyle w:val="ListNumber"/>
       </w:pPr>
       <w:r>
-        <w:t>6-digit code → Confirm (or honest outcome).</w:t>
+        <w:t>5 wrong codes → review flag.</w:t>
       </w:r>
     </w:p>
     <w:p>
@@ -1577,7 +1943,7 @@
         <w:pStyle w:val="ListNumber"/>
       </w:pPr>
       <w:r>
-        <w:t>Wrong code: 5 tries then review flag.</w:t>
+        <w:t>Offline queues + syncs.</w:t>
       </w:r>
     </w:p>
     <w:p>
@@ -1585,7 +1951,7 @@
         <w:pStyle w:val="ListNumber"/>
       </w:pPr>
       <w:r>
-        <w:t>Offline: queued, syncs later.</w:t>
+        <w:t>Sees reliability + cut on each row.</w:t>
       </w:r>
     </w:p>
     <w:p>
@@ -1593,7 +1959,7 @@
         <w:pStyle w:val="Heading2"/>
       </w:pPr>
       <w:r>
-        <w:t>Owner (7 phases)</w:t>
+        <w:t>Owner (8 phases)</w:t>
       </w:r>
     </w:p>
     <w:p>
@@ -1601,7 +1967,7 @@
         <w:pStyle w:val="ListNumber"/>
       </w:pPr>
       <w:r>
-        <w:t>/login → /onboard (name, WhatsApp, areas) → agency.</w:t>
+        <w:t>Email login → onboard (name, WhatsApp, areas).</w:t>
       </w:r>
     </w:p>
     <w:p>
@@ -1609,7 +1975,7 @@
         <w:pStyle w:val="ListNumber"/>
       </w:pPr>
       <w:r>
-        <w:t>Team: add hosts by exact sign-in numbers.</w:t>
+        <w:t>Checklist banner 1-of-3 until live.</w:t>
       </w:r>
     </w:p>
     <w:p>
@@ -1617,7 +1983,7 @@
         <w:pStyle w:val="ListNumber"/>
       </w:pPr>
       <w:r>
-        <w:t>Inventory: add/import → photos/date/price/host/terms → slots → Publish.</w:t>
+        <w:t>Team by exact numbers; listings add/import; photos/date/price/host/terms edit.</w:t>
       </w:r>
     </w:p>
     <w:p>
@@ -1625,7 +1991,7 @@
         <w:pStyle w:val="ListNumber"/>
       </w:pPr>
       <w:r>
-        <w:t>Freshness: stale auto-pause + nudge; 1-tap reconfirm.</w:t>
+        <w:t>Slots per listing; publish (gates enforced).</w:t>
       </w:r>
     </w:p>
     <w:p>
@@ -1633,7 +1999,7 @@
         <w:pStyle w:val="ListNumber"/>
       </w:pPr>
       <w:r>
-        <w:t>Bookings inbox: message/confirm/cancel; close deals; mark payouts.</w:t>
+        <w:t>Freshness: auto-pause + nudge + 1-tap reconfirm.</w:t>
       </w:r>
     </w:p>
     <w:p>
@@ -1641,7 +2007,7 @@
         <w:pStyle w:val="ListNumber"/>
       </w:pPr>
       <w:r>
-        <w:t>Proof: scorecard, ledger export, Fresh Score, weekly WhatsApp+email summary.</w:t>
+        <w:t>Inbox: message/confirm/cancel; close with naira; mark payouts.</w:t>
       </w:r>
     </w:p>
     <w:p>
@@ -1649,7 +2015,15 @@
         <w:pStyle w:val="ListNumber"/>
       </w:pPr>
       <w:r>
-        <w:t>Checklist banner retires at Step 3; CSV exports on demand.</w:t>
+        <w:t>Proof: scorecard, ledger CSV, Fresh Score, weekly summary; exports on demand.</w:t>
+      </w:r>
+    </w:p>
+    <w:p>
+      <w:pPr>
+        <w:pStyle w:val="ListNumber"/>
+      </w:pPr>
+      <w:r>
+        <w:t>Suspended state banners + support path.</w:t>
       </w:r>
     </w:p>
     <w:p>
@@ -1665,7 +2039,7 @@
         <w:pStyle w:val="ListBullet"/>
       </w:pPr>
       <w:r>
-        <w:t>Reviewer: /review triage (looking-into/fixed/dismiss); evidence accept/reject; never auto-enforces.</w:t>
+        <w:t>Reviewer: triage queue + evidence accept/reject; human-only, audited.</w:t>
       </w:r>
     </w:p>
     <w:p>
@@ -1673,7 +2047,7 @@
         <w:pStyle w:val="ListBullet"/>
       </w:pPr>
       <w:r>
-        <w:t>Admin: /admin suspend/reactivate shops (cards vanish, history stays), ban/unban people; gated by allowlist/admin role.</w:t>
+        <w:t>Admin: suspend/reactivate (cards vanish, history stays), ban/unban people; allowlist-gated.</w:t>
       </w:r>
     </w:p>
     <w:p>
@@ -1681,7 +2055,7 @@
         <w:pStyle w:val="Heading1"/>
       </w:pPr>
       <w:r>
-        <w:t>19. Redesign constraints (must keep)</w:t>
+        <w:t>19. Redesign constraints (law)</w:t>
       </w:r>
     </w:p>
     <w:p>
@@ -1689,7 +2063,7 @@
         <w:pStyle w:val="ListBullet"/>
       </w:pPr>
       <w:r>
-        <w:t>Evidence-first copy, exact dates, named hosts, title disclaimer on every card/pass.</w:t>
+        <w:t>Copy honesty: exact dates, named hosts, title disclaimer, no 'Verified' badges, receipts = observed facts.</w:t>
       </w:r>
     </w:p>
     <w:p>
@@ -1697,7 +2071,7 @@
         <w:pStyle w:val="ListBullet"/>
       </w:pPr>
       <w:r>
-        <w:t>Type ≥14 (inputs 16), targets ≥44/48px, focus rings, reduced-motion/transparency fallbacks, 4.5:1 text.</w:t>
+        <w:t>Ergonomics: 16px min (inputs always), 48px targets, focus rings, reduced-motion/transparency, 4.5:1.</w:t>
       </w:r>
     </w:p>
     <w:p>
@@ -1705,7 +2079,7 @@
         <w:pStyle w:val="ListBullet"/>
       </w:pPr>
       <w:r>
-        <w:t>One primary action per screen; buyers never type IDs (links prefill); staff subpages always link back.</w:t>
+        <w:t>Flow: one primary action/screen; buyers never type IDs; staff pages link back; new owners get exactly one next step.</w:t>
       </w:r>
     </w:p>
     <w:p>
@@ -1713,7 +2087,7 @@
         <w:pStyle w:val="ListBullet"/>
       </w:pPr>
       <w:r>
-        <w:t>No 'Verified' badges; status = icon + label + explanation; receipts state observable facts only.</w:t>
+        <w:t>Responsive: mobile single-column thumb-first; desktop expands to columns without shrinking text/targets; review actions stay stacked deliberately.</w:t>
       </w:r>
     </w:p>
     <w:sectPr>

</xml_diff>